<commit_message>
finished documention and uml
</commit_message>
<xml_diff>
--- a/docs/Docs_Template_SmarthHouse_Editable.docx
+++ b/docs/Docs_Template_SmarthHouse_Editable.docx
@@ -304,15 +304,7 @@
     </w:p>
     <w:p>
       <w:r>
-        <w:t xml:space="preserve">Modellare una </w:t>
-      </w:r>
-      <w:proofErr w:type="spellStart"/>
-      <w:r>
-        <w:t>smarth</w:t>
-      </w:r>
-      <w:proofErr w:type="spellEnd"/>
-      <w:r>
-        <w:t xml:space="preserve"> house con un sistema di illuminazione composto da lampade, lampade eco, un dispositivo che gestisce due lampade e una striscia di lampade</w:t>
+        <w:t>Modellare una smarth house con un sistema di illuminazione composto da lampade, lampade eco, un dispositivo che gestisce due lampade e una striscia di lampade</w:t>
       </w:r>
     </w:p>
     <w:p>
@@ -354,146 +346,38 @@
       </w:r>
     </w:p>
     <w:p>
-      <w:proofErr w:type="spellStart"/>
-      <w:r>
-        <w:t>AbstractDevice</w:t>
-      </w:r>
-      <w:proofErr w:type="spellEnd"/>
-      <w:r>
-        <w:t>: è una classe astratta che permette di modellare un qualsiasi dispositivo elettronico, il quale possiede un nome, un id identificativo, uno stato (On, Off), un orario di creazione e un orario dove vengono salvate le modifiche. Offre inoltre la possibilità di spegnere ed accendere il dispositivo.</w:t>
+      <w:r>
+        <w:t>AbstractDevice: è una classe astratta che permette di modellare un qualsiasi dispositivo elettronico, il quale possiede un nome, un id identificativo, uno stato (On, Off), un orario di creazione e un orario dove vengono salvate le modifiche. Offre inoltre la possibilità di spegnere ed accendere il dispositivo.</w:t>
       </w:r>
     </w:p>
     <w:p/>
     <w:p>
-      <w:proofErr w:type="spellStart"/>
-      <w:r>
-        <w:t>AbstarctLamp</w:t>
-      </w:r>
-      <w:proofErr w:type="spellEnd"/>
-      <w:r>
-        <w:t xml:space="preserve">: è una classe astratta, figlia di </w:t>
-      </w:r>
-      <w:proofErr w:type="spellStart"/>
-      <w:r>
-        <w:t>AbstractDevice</w:t>
-      </w:r>
-      <w:proofErr w:type="spellEnd"/>
-      <w:r>
-        <w:t>, che permette di modellare una lampada, la quale possiede una luminosità massima, una luminosità minima e la luminosità corrente. È possibile, oltre a spegnere ed accendere la lampada anche, aumentare e diminuire la luminosità di un determinato valore ed impostarla a determinato valore.</w:t>
+      <w:r>
+        <w:t>AbstarctLamp: è una classe astratta, figlia di AbstractDevice, che permette di modellare una lampada, la quale possiede una luminosità massima, una luminosità minima e la luminosità corrente. È possibile, oltre a spegnere ed accendere la lampada anche, aumentare e diminuire la luminosità di un determinato valore ed impostarla a determinato valore.</w:t>
       </w:r>
     </w:p>
     <w:p/>
     <w:p>
-      <w:proofErr w:type="spellStart"/>
-      <w:proofErr w:type="gramStart"/>
-      <w:r>
-        <w:t>Lamp:è</w:t>
-      </w:r>
-      <w:proofErr w:type="spellEnd"/>
-      <w:proofErr w:type="gramEnd"/>
-      <w:r>
-        <w:t xml:space="preserve"> una classe, figlia di </w:t>
-      </w:r>
-      <w:proofErr w:type="spellStart"/>
-      <w:r>
-        <w:t>AbstractLamp</w:t>
-      </w:r>
-      <w:proofErr w:type="spellEnd"/>
-      <w:r>
-        <w:t>, non aggiunge nessuna modifica.</w:t>
+      <w:r>
+        <w:t>Lamp:è una classe, figlia di AbstractLamp, non aggiunge nessuna modifica.</w:t>
       </w:r>
     </w:p>
     <w:p/>
     <w:p>
-      <w:proofErr w:type="spellStart"/>
-      <w:r>
-        <w:t>EcoLamp</w:t>
-      </w:r>
-      <w:proofErr w:type="spellEnd"/>
-      <w:r>
-        <w:t xml:space="preserve">: figlia di </w:t>
-      </w:r>
-      <w:proofErr w:type="spellStart"/>
-      <w:r>
-        <w:t>AbstractLamp</w:t>
-      </w:r>
-      <w:proofErr w:type="spellEnd"/>
-      <w:r>
-        <w:t xml:space="preserve">, è una classe che permette di modellare una lampada che in aggiunta ad </w:t>
-      </w:r>
-      <w:proofErr w:type="spellStart"/>
-      <w:r>
-        <w:t>Abstractlamp</w:t>
-      </w:r>
-      <w:proofErr w:type="spellEnd"/>
-      <w:r>
-        <w:t xml:space="preserve"> possiede un’ora di spegnimento e un timer di default dopo il quale la lampada si spegne. È possibile attivare la modalità eco, la quale spegnerà la lampada dopo un determinato lasso di tempo se indicato, altrimenti la spegnerà trascorso il timer di default.</w:t>
+      <w:r>
+        <w:t>EcoLamp: figlia di AbstractLamp, è una classe che permette di modellare una lampada che in aggiunta ad Abstractlamp possiede un’ora di spegnimento e un timer di default dopo il quale la lampada si spegne. È possibile attivare la modalità eco, la quale spegnerà la lampada dopo un determinato lasso di tempo se indicato, altrimenti la spegnerà trascorso il timer di default.</w:t>
       </w:r>
     </w:p>
     <w:p/>
     <w:p>
-      <w:proofErr w:type="spellStart"/>
-      <w:r>
-        <w:t>TwoLampDevice</w:t>
-      </w:r>
-      <w:proofErr w:type="spellEnd"/>
-      <w:r>
-        <w:t xml:space="preserve">: è una classe che permette di modellare un dispositivo che gestisce due </w:t>
-      </w:r>
-      <w:proofErr w:type="spellStart"/>
-      <w:r>
-        <w:t>AsbtractLamp</w:t>
-      </w:r>
-      <w:proofErr w:type="spellEnd"/>
-      <w:r>
-        <w:t xml:space="preserve">. Esso possiede uno stato che varia in base allo stato </w:t>
-      </w:r>
-      <w:r>
-        <w:t>delle singole</w:t>
-      </w:r>
-      <w:r>
-        <w:t xml:space="preserve"> lampade ed è possibile accendere entrambe le lampade, o accendere le singole in base al nome o a all’id, attivare la modalità eco se </w:t>
-      </w:r>
-      <w:proofErr w:type="gramStart"/>
-      <w:r>
-        <w:t>la lampade</w:t>
-      </w:r>
-      <w:proofErr w:type="gramEnd"/>
-      <w:r>
-        <w:t xml:space="preserve"> è del tipo </w:t>
-      </w:r>
-      <w:proofErr w:type="spellStart"/>
-      <w:r>
-        <w:t>EcoLamp</w:t>
-      </w:r>
-      <w:proofErr w:type="spellEnd"/>
-      <w:r>
-        <w:t>, spegnerle entrambe o spegnere le singole in base al loro id o nome, cambiare la luminosità di entrambe o cambiare la luminosità in base al nome o all’id, incrementare o decrementare la luminosità delle di entrambe le lampade oppure in base al nome o all’id.</w:t>
+      <w:r>
+        <w:t>TwoLampDevice: è una classe che permette di modellare un dispositivo che gestisce due AsbtractLamp. Esso possiede uno stato che varia in base allo stato delle singole lampade ed è possibile accendere entrambe le lampade, o accendere le singole in base al nome o a all’id, attivare la modalità eco se la lampade è del tipo EcoLamp, spegnerle entrambe o spegnere le singole in base al loro id o nome, cambiare la luminosità di entrambe o cambiare la luminosità in base al nome o all’id, incrementare o decrementare la luminosità delle di entrambe le lampade oppure in base al nome o all’id.</w:t>
       </w:r>
     </w:p>
     <w:p/>
     <w:p>
-      <w:proofErr w:type="spellStart"/>
-      <w:r>
-        <w:t>LampsRow</w:t>
-      </w:r>
-      <w:proofErr w:type="spellEnd"/>
-      <w:r>
-        <w:t xml:space="preserve">: è una classe che permette la modellazione di una striscia di lampade del tipo </w:t>
-      </w:r>
-      <w:proofErr w:type="spellStart"/>
-      <w:r>
-        <w:t>AbstractLamp</w:t>
-      </w:r>
-      <w:proofErr w:type="spellEnd"/>
-      <w:r>
-        <w:t xml:space="preserve">, il quale possiede uno stato, definito dal comportamento delle singole lampade. È possibile accenderle tutte, o accendere le singole in base a nome o id, spegnerle tutte o spegnere le singole in base a nome o id, aggiungere una lampada in ultima posizione o in una posizione scelta, rimuovere una lampada in base al nome, alla posizione o all’id, impostare la luminosità di tutte le lampade ad un determinato valore oppure impostare quella delle singole in base al nome o all’id. </w:t>
-      </w:r>
-      <w:r>
-        <w:t>Inoltre,</w:t>
-      </w:r>
-      <w:r>
-        <w:t xml:space="preserve"> sono disponibili delle funzioni per ritornare la </w:t>
+      <w:r>
+        <w:t xml:space="preserve">LampsRow: è una classe che permette la modellazione di una striscia di lampade del tipo AbstractLamp, il quale possiede uno stato, definito dal comportamento delle singole lampade. È possibile accenderle tutte, o accendere le singole in base a nome o id, spegnerle tutte o spegnere le singole in base a nome o id, aggiungere una lampada in ultima posizione o in una posizione scelta, rimuovere una lampada in base al nome, alla posizione o all’id, impostare la luminosità di tutte le lampade ad un determinato valore oppure impostare quella delle singole in base al nome o all’id. Inoltre, sono disponibili delle funzioni per ritornare la </w:t>
       </w:r>
       <w:r>
         <w:lastRenderedPageBreak/>
@@ -502,13 +386,31 @@
     </w:p>
     <w:p/>
     <w:p>
-      <w:proofErr w:type="spellStart"/>
-      <w:r>
-        <w:t>AirConditioner</w:t>
-      </w:r>
-      <w:proofErr w:type="spellEnd"/>
-      <w:r>
-        <w:t>: è una classe che permette di modellare un condizionatore, il quale possiede una determinata temperatura, una temperatura massima una temperatura minima e un valore di default del quale la temperatura può essere aumentata o diminuita. È possibile impostare la temperatura ad un determinato valore, incrementarla o decrementarla di un determinato valore o se esso non viene specificato di incrementare o decrementare la temperatura del valore di default.</w:t>
+      <w:r>
+        <w:t>AirConditioner: è una classe</w:t>
+      </w:r>
+      <w:r>
+        <w:t xml:space="preserve"> figlia di AbstractDevice</w:t>
+      </w:r>
+      <w:r>
+        <w:t xml:space="preserve"> che permette di modellare un condizionatore, il quale possiede una determinata temperatura, una temperatura massima una temperatura minima e un valore di default del quale la temperatura può essere aumentata o diminuita. È possibile impostare la temperatura ad un determinato valore, incrementarla o decrementarla di un determinato valore o se esso non viene specificato di incrementare o decrementare la temperatura del valore di default.</w:t>
+      </w:r>
+    </w:p>
+    <w:p/>
+    <w:p>
+      <w:r>
+        <w:t>Door: è una classe che permette di modellare una porta avente uno stato(Open, Closed, Locked), una password per sbloccarla un nome e un id. Offre la possibilità si chiudere e aprire la porta, si bloccarla e sbloccarla(chiuderla a chiave).</w:t>
+      </w:r>
+    </w:p>
+    <w:p/>
+    <w:p>
+      <w:r>
+        <w:t>Thermostat: è una classe figlia di AbtractDevice che modella un termostato avente una temperatura minima, massima e una corrente. È possibile impostare la temperatura corrente a un valore, oppure aumentarla o diminuirla di un valore scelto.</w:t>
+      </w:r>
+    </w:p>
+    <w:p>
+      <w:r>
+        <w:t>CCTV: è una classe figlia di AbstractDevice che modella una telecamera avente uno zoom e una rotazione minima e massima, uno zoom corrente e una rotazione corrente,  e la possibiltà di registrare. È dunque possibile regolare lo zoom e la rotazione impostandoli a dei valori scelti, avviare o stoppare la registrazione.</w:t>
       </w:r>
     </w:p>
     <w:p/>
@@ -539,56 +441,66 @@
     </w:p>
     <w:p>
       <w:pPr>
-        <w:pStyle w:val="Titolo3"/>
+        <w:pStyle w:val="NormaleWeb"/>
       </w:pPr>
       <w:bookmarkStart w:id="4" w:name="_heading=h.ltjyokb7apqk" w:colFirst="0" w:colLast="0"/>
       <w:bookmarkEnd w:id="4"/>
-      <w:r>
-        <w:t>Diagramma delle Classi</w:t>
-      </w:r>
-    </w:p>
-    <w:p>
-      <w:pPr>
-        <w:rPr>
-          <w:color w:val="2F5496"/>
-          <w:sz w:val="32"/>
-          <w:szCs w:val="32"/>
-        </w:rPr>
+    </w:p>
+    <w:p>
+      <w:pPr>
+        <w:pStyle w:val="NormaleWeb"/>
+      </w:pPr>
+    </w:p>
+    <w:p>
+      <w:pPr>
+        <w:pStyle w:val="NormaleWeb"/>
       </w:pPr>
       <w:r>
         <w:rPr>
           <w:noProof/>
         </w:rPr>
-        <w:lastRenderedPageBreak/>
         <w:drawing>
-          <wp:inline distT="114300" distB="114300" distL="114300" distR="114300" wp14:anchorId="225250E1" wp14:editId="4AF591EB">
-            <wp:extent cx="6119820" cy="7531100"/>
-            <wp:effectExtent l="0" t="0" r="0" b="0"/>
-            <wp:docPr id="1" name="image1.png"/>
-            <wp:cNvGraphicFramePr/>
+          <wp:inline distT="0" distB="0" distL="0" distR="0" wp14:anchorId="63B056D3" wp14:editId="76E9A7DC">
+            <wp:extent cx="6668161" cy="3976656"/>
+            <wp:effectExtent l="0" t="0" r="0" b="5080"/>
+            <wp:docPr id="2" name="Immagine 1" descr="Immagine che contiene schermata, diagramma, design&#10;&#10;Il contenuto generato dall'IA potrebbe non essere corretto."/>
+            <wp:cNvGraphicFramePr>
+              <a:graphicFrameLocks xmlns:a="http://schemas.openxmlformats.org/drawingml/2006/main" noChangeAspect="1"/>
+            </wp:cNvGraphicFramePr>
             <a:graphic xmlns:a="http://schemas.openxmlformats.org/drawingml/2006/main">
               <a:graphicData uri="http://schemas.openxmlformats.org/drawingml/2006/picture">
                 <pic:pic xmlns:pic="http://schemas.openxmlformats.org/drawingml/2006/picture">
                   <pic:nvPicPr>
-                    <pic:cNvPr id="0" name="image1.png"/>
-                    <pic:cNvPicPr preferRelativeResize="0"/>
+                    <pic:cNvPr id="2" name="Immagine 1" descr="Immagine che contiene schermata, diagramma, design&#10;&#10;Il contenuto generato dall'IA potrebbe non essere corretto."/>
+                    <pic:cNvPicPr>
+                      <a:picLocks noChangeAspect="1" noChangeArrowheads="1"/>
+                    </pic:cNvPicPr>
                   </pic:nvPicPr>
                   <pic:blipFill>
-                    <a:blip r:embed="rId8"/>
+                    <a:blip r:embed="rId8">
+                      <a:extLst>
+                        <a:ext uri="{28A0092B-C50C-407E-A947-70E740481C1C}">
+                          <a14:useLocalDpi xmlns:a14="http://schemas.microsoft.com/office/drawing/2010/main" val="0"/>
+                        </a:ext>
+                      </a:extLst>
+                    </a:blip>
                     <a:srcRect/>
                     <a:stretch>
                       <a:fillRect/>
                     </a:stretch>
                   </pic:blipFill>
-                  <pic:spPr>
+                  <pic:spPr bwMode="auto">
                     <a:xfrm>
                       <a:off x="0" y="0"/>
-                      <a:ext cx="6119820" cy="7531100"/>
+                      <a:ext cx="6720071" cy="4007613"/>
                     </a:xfrm>
                     <a:prstGeom prst="rect">
                       <a:avLst/>
                     </a:prstGeom>
-                    <a:ln/>
+                    <a:noFill/>
+                    <a:ln>
+                      <a:noFill/>
+                    </a:ln>
                   </pic:spPr>
                 </pic:pic>
               </a:graphicData>
@@ -596,6 +508,20 @@
           </wp:inline>
         </w:drawing>
       </w:r>
+    </w:p>
+    <w:p>
+      <w:pPr>
+        <w:pStyle w:val="Titolo3"/>
+      </w:pPr>
+    </w:p>
+    <w:p>
+      <w:pPr>
+        <w:rPr>
+          <w:color w:val="2F5496"/>
+          <w:sz w:val="32"/>
+          <w:szCs w:val="32"/>
+        </w:rPr>
+      </w:pPr>
       <w:r>
         <w:rPr>
           <w:color w:val="2F5496"/>
@@ -621,15 +547,7 @@
     </w:p>
     <w:p>
       <w:r>
-        <w:t xml:space="preserve">Per i test nel progetto si presentano tre classi che testano la classe rispettivamente citata nel nome. Esse </w:t>
-      </w:r>
-      <w:proofErr w:type="spellStart"/>
-      <w:r>
-        <w:t>sonmo</w:t>
-      </w:r>
-      <w:proofErr w:type="spellEnd"/>
-      <w:r>
-        <w:t>:</w:t>
+        <w:t>Nel progetto troviamo diverse classi dedicate ai test, e sono:</w:t>
       </w:r>
     </w:p>
     <w:p>
@@ -640,19 +558,15 @@
         </w:numPr>
         <w:spacing w:after="0"/>
       </w:pPr>
-      <w:proofErr w:type="spellStart"/>
-      <w:r>
-        <w:t>StandardLampTest</w:t>
-      </w:r>
-      <w:proofErr w:type="spellEnd"/>
-      <w:r>
-        <w:t xml:space="preserve">: Test di </w:t>
-      </w:r>
-      <w:proofErr w:type="spellStart"/>
-      <w:r>
-        <w:t>StandardLamp</w:t>
-      </w:r>
-      <w:proofErr w:type="spellEnd"/>
+      <w:r>
+        <w:t xml:space="preserve">EcoLampTest: </w:t>
+      </w:r>
+      <w:r>
+        <w:t>t</w:t>
+      </w:r>
+      <w:r>
+        <w:t>est di EcoLamp</w:t>
+      </w:r>
     </w:p>
     <w:p>
       <w:pPr>
@@ -662,19 +576,9 @@
         </w:numPr>
         <w:spacing w:after="0"/>
       </w:pPr>
-      <w:proofErr w:type="spellStart"/>
-      <w:r>
-        <w:t>EcoLampTest</w:t>
-      </w:r>
-      <w:proofErr w:type="spellEnd"/>
-      <w:r>
-        <w:t xml:space="preserve">: Test di </w:t>
-      </w:r>
-      <w:proofErr w:type="spellStart"/>
-      <w:r>
-        <w:t>EcoLamp</w:t>
-      </w:r>
-      <w:proofErr w:type="spellEnd"/>
+      <w:r>
+        <w:t>LampTest: test di Lamp</w:t>
+      </w:r>
     </w:p>
     <w:p>
       <w:pPr>
@@ -682,20 +586,59 @@
           <w:ilvl w:val="0"/>
           <w:numId w:val="2"/>
         </w:numPr>
-      </w:pPr>
-      <w:proofErr w:type="spellStart"/>
-      <w:r>
-        <w:t>TwoLampDeviceTest</w:t>
-      </w:r>
-      <w:proofErr w:type="spellEnd"/>
-      <w:r>
-        <w:t xml:space="preserve">: Test di </w:t>
-      </w:r>
-      <w:proofErr w:type="spellStart"/>
-      <w:r>
-        <w:t>TwoLampDevice</w:t>
-      </w:r>
-      <w:proofErr w:type="spellEnd"/>
+        <w:spacing w:after="0"/>
+      </w:pPr>
+      <w:r>
+        <w:t>LampsRowTest: test di LampsRow</w:t>
+      </w:r>
+    </w:p>
+    <w:p>
+      <w:pPr>
+        <w:numPr>
+          <w:ilvl w:val="0"/>
+          <w:numId w:val="2"/>
+        </w:numPr>
+        <w:spacing w:after="0"/>
+      </w:pPr>
+      <w:r>
+        <w:t>TwoLampDeviceTest: test di TwoLampDevice</w:t>
+      </w:r>
+    </w:p>
+    <w:p>
+      <w:pPr>
+        <w:numPr>
+          <w:ilvl w:val="0"/>
+          <w:numId w:val="2"/>
+        </w:numPr>
+        <w:spacing w:after="0"/>
+      </w:pPr>
+      <w:r>
+        <w:t>AirConditionerTest: test di AirConditioner</w:t>
+      </w:r>
+    </w:p>
+    <w:p>
+      <w:pPr>
+        <w:numPr>
+          <w:ilvl w:val="0"/>
+          <w:numId w:val="2"/>
+        </w:numPr>
+        <w:spacing w:after="0"/>
+      </w:pPr>
+      <w:r>
+        <w:t>CCTVTest: test di CCTV</w:t>
+      </w:r>
+    </w:p>
+    <w:p>
+      <w:pPr>
+        <w:numPr>
+          <w:ilvl w:val="0"/>
+          <w:numId w:val="2"/>
+        </w:numPr>
+        <w:spacing w:after="0"/>
+      </w:pPr>
+      <w:r>
+        <w:t>DoorTEst: test di Door</w:t>
+      </w:r>
     </w:p>
     <w:sectPr>
       <w:headerReference w:type="default" r:id="rId9"/>
@@ -920,25 +863,7 @@
               <w:bCs/>
               <w:color w:val="000000"/>
             </w:rPr>
-            <w:t xml:space="preserve">Doc. </w:t>
-          </w:r>
-          <w:proofErr w:type="spellStart"/>
-          <w:r>
-            <w:rPr>
-              <w:b/>
-              <w:bCs/>
-              <w:color w:val="000000"/>
-            </w:rPr>
-            <w:t>reference</w:t>
-          </w:r>
-          <w:proofErr w:type="spellEnd"/>
-          <w:r>
-            <w:rPr>
-              <w:b/>
-              <w:bCs/>
-              <w:color w:val="000000"/>
-            </w:rPr>
-            <w:t>:</w:t>
+            <w:t>Doc. reference:</w:t>
           </w:r>
         </w:p>
       </w:tc>
@@ -1069,23 +994,13 @@
               <w:color w:val="000000"/>
             </w:rPr>
           </w:pPr>
-          <w:proofErr w:type="spellStart"/>
           <w:r>
             <w:rPr>
               <w:b/>
               <w:bCs/>
               <w:color w:val="000000"/>
             </w:rPr>
-            <w:t>Verified</w:t>
-          </w:r>
-          <w:proofErr w:type="spellEnd"/>
-          <w:r>
-            <w:rPr>
-              <w:b/>
-              <w:bCs/>
-              <w:color w:val="000000"/>
-            </w:rPr>
-            <w:t xml:space="preserve"> by: </w:t>
+            <w:t>Verified by: </w:t>
           </w:r>
         </w:p>
       </w:tc>

</xml_diff>